<commit_message>
Fix R-05: offer only the formats the scrubber can actually open
Discovery came from the suite-wide extension list while the loader handled
nine containers, so a valid WavPack/APE/Musepack/Speex/DSD file in a chosen
folder was listed and then reported [UNREADABLE] with an error count - a
failure against audio that is fine.

Extension discovery and loading now derive from one _LOADERS table, and the
tag scanner that builds the preserve checklist samples that same set instead
of the suite list, so it no longer spends its 100-file budget on files the
run will not process.
</commit_message>
<xml_diff>
--- a/user_guides/individual_programs/metadata_scrubber/Metadata_Scrubber_User_Guide.docx
+++ b/user_guides/individual_programs/metadata_scrubber/Metadata_Scrubber_User_Guide.docx
@@ -47,7 +47,17 @@
     </w:p>
     <w:p>
       <w:r>
-        <w:t>The core scrubber supports all nine suite audio formats except WMA: MP3, FLAC, OGG, M4A, MP4, Opus, WAV, AIFF, and AIF. WMA is excluded because mutagen has no ASF tag handler. The GUI discovers custom tags by sampling up to 100 supported audio files in the selected directory. Processing then scans the supported files in that directory.</w:t>
+        <w:t>The scrubber works with nine containers: MP3, FLAC, OGG, Opus, M4A, MP4, WAV, AIFF, and AIF. Those are the only files it lists, samples, or processes.</w:t>
+      </w:r>
+    </w:p>
+    <w:p>
+      <w:r>
+        <w:t>Other formats the suite can convert are deliberately not offered here: WavPack (.wv), Monkey's Audio (.ape), Musepack (.mpc), Speex (.spx), DSD (.dsf), and WMA. WMA is excluded because mutagen has no ASF tag handler at all. The remaining five can be decoded for conversion, but the scrubber wipes a file's tags and then restores individual tag frames, and no frame-level tag handler exists for those containers yet — listing them would mean reporting a valid file as unreadable. A folder holding only such files reports "No supported audio files found" rather than an error per file.</w:t>
+      </w:r>
+    </w:p>
+    <w:p>
+      <w:r>
+        <w:t>The GUI discovers custom tags by sampling up to 100 supported audio files in the selected directory. Processing then scans the supported files in that directory.</w:t>
       </w:r>
     </w:p>
     <w:p>

</xml_diff>